<commit_message>
[REFACTOR]: moved RabbitMQ config file from package messaging to package config
</commit_message>
<xml_diff>
--- a/docs/3.0 - esercizio_integrazione_crm.docx
+++ b/docs/3.0 - esercizio_integrazione_crm.docx
@@ -303,7 +303,7 @@
           <w:noProof/>
         </w:rPr>
         <w:pict w14:anchorId="68B09B88">
-          <v:rect id="_x0000_i1035" style="width:468pt;height:.05pt" o:hralign="center" o:hrstd="t" o:hr="t" fillcolor="#a0a0a0" stroked="f"/>
+          <v:rect id="_x0000_i1026" style="width:468pt;height:.05pt" o:hralign="center" o:hrstd="t" o:hr="t" fillcolor="#a0a0a0" stroked="f"/>
         </w:pict>
       </w:r>
     </w:p>
@@ -371,28 +371,18 @@
         <w:rPr>
           <w:b/>
           <w:bCs/>
-          <w:strike/>
-        </w:rPr>
-      </w:pPr>
-      <w:r>
-        <w:rPr>
-          <w:b/>
-          <w:bCs/>
-          <w:strike/>
+        </w:rPr>
+      </w:pPr>
+      <w:r>
+        <w:rPr>
+          <w:b/>
+          <w:bCs/>
         </w:rPr>
         <w:t>4.1. Modello Dati (JPA)</w:t>
       </w:r>
     </w:p>
     <w:p>
-      <w:pPr>
-        <w:rPr>
-          <w:strike/>
-        </w:rPr>
-      </w:pPr>
-      <w:r>
-        <w:rPr>
-          <w:strike/>
-        </w:rPr>
+      <w:r>
         <w:t>Dovrete progettare il database con due entità in relazione Uno-a-Molti:</w:t>
       </w:r>
     </w:p>
@@ -403,13 +393,11 @@
           <w:numId w:val="4"/>
         </w:numPr>
         <w:rPr>
-          <w:strike/>
-          <w:lang w:val="en-US"/>
-        </w:rPr>
-      </w:pPr>
-      <w:r>
-        <w:rPr>
-          <w:strike/>
+          <w:lang w:val="en-US"/>
+        </w:rPr>
+      </w:pPr>
+      <w:r>
+        <w:rPr>
           <w:lang w:val="en-US"/>
         </w:rPr>
         <w:t>Campaign (id, campaignId, subCampaignId, ecc.)</w:t>
@@ -422,36 +410,25 @@
           <w:numId w:val="4"/>
         </w:numPr>
         <w:rPr>
-          <w:strike/>
-          <w:lang w:val="en-US"/>
-        </w:rPr>
-      </w:pPr>
-      <w:r>
-        <w:rPr>
-          <w:strike/>
+          <w:lang w:val="en-US"/>
+        </w:rPr>
+      </w:pPr>
+      <w:r>
+        <w:rPr>
           <w:lang w:val="en-US"/>
         </w:rPr>
         <w:t>Attendee (id, campaign_id, cn, firstName, isCompanion, qrCode, ecc.)</w:t>
       </w:r>
     </w:p>
     <w:p>
-      <w:pPr>
-        <w:rPr>
-          <w:strike/>
-        </w:rPr>
-      </w:pPr>
       <w:r>
         <w:rPr>
           <w:i/>
           <w:iCs/>
-          <w:strike/>
         </w:rPr>
         <w:t>Nota di Design:</w:t>
       </w:r>
       <w:r>
-        <w:rPr>
-          <w:strike/>
-        </w:rPr>
         <w:t xml:space="preserve"> Valutate con attenzione come definire l'univocità di una Campagna nel database, considerando che subCampaignId può essere nullo.</w:t>
       </w:r>
     </w:p>
@@ -566,7 +543,7 @@
           <w:noProof/>
         </w:rPr>
         <w:pict w14:anchorId="5A4B9855">
-          <v:rect id="_x0000_i1036" style="width:468pt;height:.05pt" o:hralign="center" o:hrstd="t" o:hr="t" fillcolor="#a0a0a0" stroked="f"/>
+          <v:rect id="_x0000_i1027" style="width:468pt;height:.05pt" o:hralign="center" o:hrstd="t" o:hr="t" fillcolor="#a0a0a0" stroked="f"/>
         </w:pict>
       </w:r>
     </w:p>
@@ -2002,17 +1979,17 @@
           <w:noProof/>
         </w:rPr>
         <w:pict w14:anchorId="04FB4AD0">
+          <v:rect id="_x0000_i1028" style="width:468pt;height:.05pt" o:hralign="center" o:hrstd="t" o:hr="t" fillcolor="#a0a0a0" stroked="f"/>
+        </w:pict>
+      </w:r>
+    </w:p>
+    <w:p>
+      <w:r>
+        <w:rPr>
+          <w:noProof/>
+        </w:rPr>
+        <w:pict w14:anchorId="60E72EE4">
           <v:rect id="_x0000_i1029" style="width:468pt;height:.05pt" o:hralign="center" o:hrstd="t" o:hr="t" fillcolor="#a0a0a0" stroked="f"/>
-        </w:pict>
-      </w:r>
-    </w:p>
-    <w:p>
-      <w:r>
-        <w:rPr>
-          <w:noProof/>
-        </w:rPr>
-        <w:pict w14:anchorId="60E72EE4">
-          <v:rect id="_x0000_i1030" style="width:468pt;height:.05pt" o:hralign="center" o:hrstd="t" o:hr="t" fillcolor="#a0a0a0" stroked="f"/>
         </w:pict>
       </w:r>
     </w:p>
@@ -4495,12 +4472,7 @@
 </file>
 
 <file path=customXml/item1.xml><?xml version="1.0" encoding="utf-8"?>
-<?mso-contentType ?>
-<FormTemplates xmlns="http://schemas.microsoft.com/sharepoint/v3/contenttype/forms">
-  <Display>DocumentLibraryForm</Display>
-  <Edit>DocumentLibraryForm</Edit>
-  <New>DocumentLibraryForm</New>
-</FormTemplates>
+<b:Sources xmlns:b="http://schemas.openxmlformats.org/officeDocument/2006/bibliography" xmlns="http://schemas.openxmlformats.org/officeDocument/2006/bibliography" SelectedStyle="\APASixthEditionOfficeOnline.xsl" StyleName="APA" Version="6"/>
 </file>
 
 <file path=customXml/item2.xml><?xml version="1.0" encoding="utf-8"?>
@@ -4672,7 +4644,12 @@
 </file>
 
 <file path=customXml/item3.xml><?xml version="1.0" encoding="utf-8"?>
-<b:Sources xmlns:b="http://schemas.openxmlformats.org/officeDocument/2006/bibliography" xmlns="http://schemas.openxmlformats.org/officeDocument/2006/bibliography" SelectedStyle="\APASixthEditionOfficeOnline.xsl" StyleName="APA" Version="6"/>
+<?mso-contentType ?>
+<FormTemplates xmlns="http://schemas.microsoft.com/sharepoint/v3/contenttype/forms">
+  <Display>DocumentLibraryForm</Display>
+  <Edit>DocumentLibraryForm</Edit>
+  <New>DocumentLibraryForm</New>
+</FormTemplates>
 </file>
 
 <file path=customXml/item4.xml><?xml version="1.0" encoding="utf-8"?>
@@ -4682,9 +4659,9 @@
 </file>
 
 <file path=customXml/itemProps1.xml><?xml version="1.0" encoding="utf-8"?>
-<ds:datastoreItem xmlns:ds="http://schemas.openxmlformats.org/officeDocument/2006/customXml" ds:itemID="{38689D30-0BA3-4E10-B43B-D58B3E80B7A2}">
+<ds:datastoreItem xmlns:ds="http://schemas.openxmlformats.org/officeDocument/2006/customXml" ds:itemID="{096017E8-6FC8-4473-B04A-8C4F3E3293F8}">
   <ds:schemaRefs>
-    <ds:schemaRef ds:uri="http://schemas.microsoft.com/sharepoint/v3/contenttype/forms"/>
+    <ds:schemaRef ds:uri="http://schemas.openxmlformats.org/officeDocument/2006/bibliography"/>
   </ds:schemaRefs>
 </ds:datastoreItem>
 </file>
@@ -4708,9 +4685,9 @@
 </file>
 
 <file path=customXml/itemProps3.xml><?xml version="1.0" encoding="utf-8"?>
-<ds:datastoreItem xmlns:ds="http://schemas.openxmlformats.org/officeDocument/2006/customXml" ds:itemID="{096017E8-6FC8-4473-B04A-8C4F3E3293F8}">
+<ds:datastoreItem xmlns:ds="http://schemas.openxmlformats.org/officeDocument/2006/customXml" ds:itemID="{38689D30-0BA3-4E10-B43B-D58B3E80B7A2}">
   <ds:schemaRefs>
-    <ds:schemaRef ds:uri="http://schemas.openxmlformats.org/officeDocument/2006/bibliography"/>
+    <ds:schemaRef ds:uri="http://schemas.microsoft.com/sharepoint/v3/contenttype/forms"/>
   </ds:schemaRefs>
 </ds:datastoreItem>
 </file>

</xml_diff>